<commit_message>
Updated Commit: Precision API BDD AUTOMATION FRAMEWORK
</commit_message>
<xml_diff>
--- a/PRECISION_API_BDD_AUTOMATION_FRAMEWORK/Documentation.docx
+++ b/PRECISION_API_BDD_AUTOMATION_FRAMEWORK/Documentation.docx
@@ -228,88 +228,9 @@
           <w:sz w:val="28"/>
           <w:szCs w:val="28"/>
         </w:rPr>
-        <w:t>EXECUTIVE SUMMARY</w:t>
-      </w:r>
-    </w:p>
-    <w:p>
-      <w:pPr>
-        <w:pStyle w:val="NormalWeb"/>
-        <w:jc w:val="both"/>
-        <w:rPr>
-          <w:rFonts w:asciiTheme="minorHAnsi" w:hAnsiTheme="minorHAnsi" w:cstheme="minorHAnsi"/>
-        </w:rPr>
-      </w:pPr>
-      <w:r>
-        <w:rPr>
-          <w:rFonts w:asciiTheme="minorHAnsi" w:hAnsiTheme="minorHAnsi" w:cstheme="minorHAnsi"/>
-        </w:rPr>
-        <w:t>This project presents the design and implementation of a robust API Test Automation Framework developed using Java, REST Assured, and Cucumber following Behavior-Driven Development (BDD) principles. The framework is designed to automate and validate RESTful web services using the Swagger Petstore API as the test application.</w:t>
-      </w:r>
-    </w:p>
-    <w:p>
-      <w:pPr>
-        <w:pStyle w:val="NormalWeb"/>
-        <w:jc w:val="both"/>
-        <w:rPr>
-          <w:rFonts w:asciiTheme="minorHAnsi" w:hAnsiTheme="minorHAnsi" w:cstheme="minorHAnsi"/>
-        </w:rPr>
-      </w:pPr>
-      <w:r>
-        <w:rPr>
-          <w:rFonts w:asciiTheme="minorHAnsi" w:hAnsiTheme="minorHAnsi" w:cstheme="minorHAnsi"/>
-        </w:rPr>
-        <w:t>The primary objective of this project is to simulate real-world automation practices by building a scalable, maintainable, and reusable framework. It includes implementation of core testing concepts such as CRUD operations, API chaining, cross-endpoint validation, and negative testing.</w:t>
-      </w:r>
-    </w:p>
-    <w:p>
-      <w:pPr>
-        <w:pStyle w:val="NormalWeb"/>
-        <w:jc w:val="both"/>
-        <w:rPr>
-          <w:rFonts w:asciiTheme="minorHAnsi" w:hAnsiTheme="minorHAnsi" w:cstheme="minorHAnsi"/>
-        </w:rPr>
-      </w:pPr>
-      <w:r>
-        <w:rPr>
-          <w:rFonts w:asciiTheme="minorHAnsi" w:hAnsiTheme="minorHAnsi" w:cstheme="minorHAnsi"/>
-        </w:rPr>
-        <w:t>The framework follows a modular architecture with clear separation of concerns, including feature files for test scenarios, step definitions for execution logic, and a client layer for handling API requests. Maven is used for dependency management and execution, enabling test execution through a single command.</w:t>
-      </w:r>
-    </w:p>
-    <w:p>
-      <w:pPr>
-        <w:pStyle w:val="NormalWeb"/>
-        <w:jc w:val="both"/>
-        <w:rPr>
-          <w:rFonts w:asciiTheme="minorHAnsi" w:hAnsiTheme="minorHAnsi" w:cstheme="minorHAnsi"/>
-        </w:rPr>
-      </w:pPr>
-      <w:r>
-        <w:rPr>
-          <w:rFonts w:asciiTheme="minorHAnsi" w:hAnsiTheme="minorHAnsi" w:cstheme="minorHAnsi"/>
-        </w:rPr>
-        <w:t>Additionally, Postman was used to validate API behavior, perform request testing, and understand status codes and environment configurations. Execution reports are generated to provide visibility into test results.</w:t>
-      </w:r>
-    </w:p>
-    <w:p>
-      <w:pPr>
-        <w:pStyle w:val="NormalWeb"/>
-        <w:jc w:val="both"/>
-        <w:rPr>
-          <w:rFonts w:asciiTheme="minorHAnsi" w:hAnsiTheme="minorHAnsi" w:cstheme="minorHAnsi"/>
-        </w:rPr>
-      </w:pPr>
-      <w:r>
-        <w:rPr>
-          <w:rFonts w:asciiTheme="minorHAnsi" w:hAnsiTheme="minorHAnsi" w:cstheme="minorHAnsi"/>
-        </w:rPr>
-        <w:t>This project demonstrates strong understanding of API automation, framework design, and real-time testing strategies aligned with industry standards.</w:t>
-      </w:r>
-    </w:p>
-    <w:p>
-      <w:pPr>
-        <w:pStyle w:val="NormalWeb"/>
-        <w:jc w:val="both"/>
+        <w:t>EXECUTIVE SU</w:t>
+      </w:r>
+      <w:r>
         <w:rPr>
           <w:rFonts w:asciiTheme="minorHAnsi" w:hAnsiTheme="minorHAnsi" w:cstheme="minorHAnsi"/>
           <w:b/>
@@ -317,8 +238,88 @@
           <w:sz w:val="28"/>
           <w:szCs w:val="28"/>
         </w:rPr>
-      </w:pPr>
-      <w:r>
+        <w:t>MMARY</w:t>
+      </w:r>
+    </w:p>
+    <w:p>
+      <w:pPr>
+        <w:pStyle w:val="NormalWeb"/>
+        <w:jc w:val="both"/>
+        <w:rPr>
+          <w:rFonts w:asciiTheme="minorHAnsi" w:hAnsiTheme="minorHAnsi" w:cstheme="minorHAnsi"/>
+        </w:rPr>
+      </w:pPr>
+      <w:r>
+        <w:rPr>
+          <w:rFonts w:asciiTheme="minorHAnsi" w:hAnsiTheme="minorHAnsi" w:cstheme="minorHAnsi"/>
+        </w:rPr>
+        <w:t>This project presents the design and implementation of a robust API Test Automation Framework developed using Java, REST Assured, and Cucumber following Behavior-Driven Development (BDD) principles. The framework is designed to automate and validate RESTful web services using the Swagger Petstore API as the test application.</w:t>
+      </w:r>
+    </w:p>
+    <w:p>
+      <w:pPr>
+        <w:pStyle w:val="NormalWeb"/>
+        <w:jc w:val="both"/>
+        <w:rPr>
+          <w:rFonts w:asciiTheme="minorHAnsi" w:hAnsiTheme="minorHAnsi" w:cstheme="minorHAnsi"/>
+        </w:rPr>
+      </w:pPr>
+      <w:r>
+        <w:rPr>
+          <w:rFonts w:asciiTheme="minorHAnsi" w:hAnsiTheme="minorHAnsi" w:cstheme="minorHAnsi"/>
+        </w:rPr>
+        <w:t>The primary objective of this project is to simulate real-world automation practices by building a scalable, maintainable, and reusable framework. It includes implementation of core testing concepts such as CRUD operations, API chaining, cross-endpoint validation, and negative testing.</w:t>
+      </w:r>
+    </w:p>
+    <w:p>
+      <w:pPr>
+        <w:pStyle w:val="NormalWeb"/>
+        <w:jc w:val="both"/>
+        <w:rPr>
+          <w:rFonts w:asciiTheme="minorHAnsi" w:hAnsiTheme="minorHAnsi" w:cstheme="minorHAnsi"/>
+        </w:rPr>
+      </w:pPr>
+      <w:r>
+        <w:rPr>
+          <w:rFonts w:asciiTheme="minorHAnsi" w:hAnsiTheme="minorHAnsi" w:cstheme="minorHAnsi"/>
+        </w:rPr>
+        <w:t>The framework follows a modular architecture with clear separation of concerns, including feature files for test scenarios, step definitions for execution logic, and a client layer for handling API requests. Maven is used for dependency management and execution, enabling test execution through a single command.</w:t>
+      </w:r>
+    </w:p>
+    <w:p>
+      <w:pPr>
+        <w:pStyle w:val="NormalWeb"/>
+        <w:jc w:val="both"/>
+        <w:rPr>
+          <w:rFonts w:asciiTheme="minorHAnsi" w:hAnsiTheme="minorHAnsi" w:cstheme="minorHAnsi"/>
+        </w:rPr>
+      </w:pPr>
+      <w:r>
+        <w:rPr>
+          <w:rFonts w:asciiTheme="minorHAnsi" w:hAnsiTheme="minorHAnsi" w:cstheme="minorHAnsi"/>
+        </w:rPr>
+        <w:t>Additionally, Postman was used to validate API behavior, perform request testing, and understand status codes and environment configurations. Execution reports are generated to provide visibility into test results.</w:t>
+      </w:r>
+    </w:p>
+    <w:p>
+      <w:pPr>
+        <w:pStyle w:val="NormalWeb"/>
+        <w:jc w:val="both"/>
+        <w:rPr>
+          <w:rFonts w:asciiTheme="minorHAnsi" w:hAnsiTheme="minorHAnsi" w:cstheme="minorHAnsi"/>
+        </w:rPr>
+      </w:pPr>
+      <w:r>
+        <w:rPr>
+          <w:rFonts w:asciiTheme="minorHAnsi" w:hAnsiTheme="minorHAnsi" w:cstheme="minorHAnsi"/>
+        </w:rPr>
+        <w:t>This project demonstrates strong understanding of API automation, framework design, and real-time testing strategies aligned with industry standards.</w:t>
+      </w:r>
+    </w:p>
+    <w:p>
+      <w:pPr>
+        <w:pStyle w:val="NormalWeb"/>
+        <w:jc w:val="both"/>
         <w:rPr>
           <w:rFonts w:asciiTheme="minorHAnsi" w:hAnsiTheme="minorHAnsi" w:cstheme="minorHAnsi"/>
           <w:b/>
@@ -326,6 +327,15 @@
           <w:sz w:val="28"/>
           <w:szCs w:val="28"/>
         </w:rPr>
+      </w:pPr>
+      <w:r>
+        <w:rPr>
+          <w:rFonts w:asciiTheme="minorHAnsi" w:hAnsiTheme="minorHAnsi" w:cstheme="minorHAnsi"/>
+          <w:b/>
+          <w:bCs/>
+          <w:sz w:val="28"/>
+          <w:szCs w:val="28"/>
+        </w:rPr>
         <w:t>INTRODUCTION</w:t>
       </w:r>
     </w:p>
@@ -396,17 +406,7 @@
           <w:sz w:val="28"/>
           <w:szCs w:val="28"/>
         </w:rPr>
-        <w:t>O</w:t>
-      </w:r>
-      <w:r>
-        <w:rPr>
-          <w:rFonts w:asciiTheme="minorHAnsi" w:hAnsiTheme="minorHAnsi" w:cstheme="minorHAnsi"/>
-          <w:b/>
-          <w:bCs/>
-          <w:sz w:val="28"/>
-          <w:szCs w:val="28"/>
-        </w:rPr>
-        <w:t>BJECTIVE</w:t>
+        <w:t>OBJECTIVE</w:t>
       </w:r>
     </w:p>
     <w:p>
@@ -999,10 +999,10 @@
           <w:noProof/>
         </w:rPr>
         <w:drawing>
-          <wp:inline distT="0" distB="0" distL="0" distR="0" wp14:anchorId="3D35CC2E" wp14:editId="471A9777">
-            <wp:extent cx="5731510" cy="3126105"/>
-            <wp:effectExtent l="0" t="0" r="2540" b="0"/>
-            <wp:docPr id="1794516497" name="Picture 5"/>
+          <wp:inline distT="0" distB="0" distL="0" distR="0" wp14:anchorId="5316070F" wp14:editId="0FC0F76F">
+            <wp:extent cx="5731510" cy="3878580"/>
+            <wp:effectExtent l="0" t="0" r="2540" b="7620"/>
+            <wp:docPr id="1589956545" name="Picture 1"/>
             <wp:cNvGraphicFramePr>
               <a:graphicFrameLocks xmlns:a="http://schemas.openxmlformats.org/drawingml/2006/main" noChangeAspect="1"/>
             </wp:cNvGraphicFramePr>
@@ -1010,11 +1010,11 @@
               <a:graphicData uri="http://schemas.openxmlformats.org/drawingml/2006/picture">
                 <pic:pic xmlns:pic="http://schemas.openxmlformats.org/drawingml/2006/picture">
                   <pic:nvPicPr>
-                    <pic:cNvPr id="1794516497" name="Picture 1794516497"/>
+                    <pic:cNvPr id="1589956545" name="Picture 1589956545"/>
                     <pic:cNvPicPr/>
                   </pic:nvPicPr>
                   <pic:blipFill>
-                    <a:blip r:embed="rId6" cstate="print">
+                    <a:blip r:embed="rId6">
                       <a:extLst>
                         <a:ext uri="{28A0092B-C50C-407E-A947-70E740481C1C}">
                           <a14:useLocalDpi xmlns:a14="http://schemas.microsoft.com/office/drawing/2010/main" val="0"/>
@@ -1028,7 +1028,7 @@
                   <pic:spPr>
                     <a:xfrm>
                       <a:off x="0" y="0"/>
-                      <a:ext cx="5731510" cy="3126105"/>
+                      <a:ext cx="5731510" cy="3878580"/>
                     </a:xfrm>
                     <a:prstGeom prst="rect">
                       <a:avLst/>
@@ -1679,6 +1679,7 @@
         <w:rPr>
           <w:rFonts w:asciiTheme="minorHAnsi" w:hAnsiTheme="minorHAnsi" w:cstheme="minorHAnsi"/>
         </w:rPr>
+        <w:lastRenderedPageBreak/>
         <w:t>This scenario ensures proper handling of invalid inputs and error responses.</w:t>
       </w:r>
       <w:r>
@@ -1728,7 +1729,6 @@
         <w:rPr>
           <w:rFonts w:asciiTheme="minorHAnsi" w:hAnsiTheme="minorHAnsi" w:cstheme="minorHAnsi"/>
         </w:rPr>
-        <w:lastRenderedPageBreak/>
         <w:t>This test case validates consistency of data across multiple API endpoints.</w:t>
       </w:r>
     </w:p>
@@ -2240,6 +2240,7 @@
         <w:rPr>
           <w:rFonts w:asciiTheme="minorHAnsi" w:hAnsiTheme="minorHAnsi" w:cstheme="minorHAnsi"/>
         </w:rPr>
+        <w:lastRenderedPageBreak/>
         <w:t>Postman helped in building a strong understanding of API testing concepts, which were later implemented in the automation framework.</w:t>
       </w:r>
     </w:p>
@@ -2272,7 +2273,6 @@
           <w:sz w:val="28"/>
           <w:szCs w:val="28"/>
         </w:rPr>
-        <w:lastRenderedPageBreak/>
         <w:t>PROJECT EXECUTION (HOW TO RUN)</w:t>
       </w:r>
     </w:p>
@@ -2707,6 +2707,7 @@
         <w:rPr>
           <w:rFonts w:asciiTheme="minorHAnsi" w:hAnsiTheme="minorHAnsi" w:cstheme="minorHAnsi" w:hint="default"/>
         </w:rPr>
+        <w:lastRenderedPageBreak/>
         <w:t>Reporting</w:t>
       </w:r>
     </w:p>
@@ -2771,20 +2772,7 @@
         <w:rPr>
           <w:rFonts w:asciiTheme="minorHAnsi" w:hAnsiTheme="minorHAnsi" w:cstheme="minorHAnsi"/>
         </w:rPr>
-        <w:lastRenderedPageBreak/>
-        <w:t>These reports help in analyzing test outcomes and identifying failure</w:t>
-      </w:r>
-      <w:r>
-        <w:rPr>
-          <w:rFonts w:asciiTheme="minorHAnsi" w:hAnsiTheme="minorHAnsi" w:cstheme="minorHAnsi"/>
-        </w:rPr>
-        <w:t>s</w:t>
-      </w:r>
-      <w:r>
-        <w:rPr>
-          <w:rFonts w:asciiTheme="minorHAnsi" w:hAnsiTheme="minorHAnsi" w:cstheme="minorHAnsi"/>
-        </w:rPr>
-        <w:t>.</w:t>
+        <w:t>These reports help in analyzing test outcomes and identifying failures.</w:t>
       </w:r>
     </w:p>
     <w:p>
@@ -2870,6 +2858,7 @@
       <w:r>
         <w:rPr>
           <w:rFonts w:asciiTheme="minorHAnsi" w:hAnsiTheme="minorHAnsi" w:cstheme="minorHAnsi"/>
+          <w:noProof/>
         </w:rPr>
         <w:drawing>
           <wp:inline distT="0" distB="0" distL="0" distR="0" wp14:anchorId="59CAAC68" wp14:editId="6ECE44D7">
@@ -3113,6 +3102,7 @@
         <w:rPr>
           <w:rFonts w:asciiTheme="minorHAnsi" w:hAnsiTheme="minorHAnsi" w:cstheme="minorHAnsi" w:hint="default"/>
         </w:rPr>
+        <w:lastRenderedPageBreak/>
         <w:t>Repository</w:t>
       </w:r>
     </w:p>
@@ -3166,7 +3156,6 @@
         <w:rPr>
           <w:rFonts w:asciiTheme="minorHAnsi" w:hAnsiTheme="minorHAnsi" w:cstheme="minorHAnsi"/>
         </w:rPr>
-        <w:lastRenderedPageBreak/>
         <w:t>Using Git ensures better collaboration, version tracking, and maintainability of the project.</w:t>
       </w:r>
     </w:p>
@@ -3513,6 +3502,7 @@
         <w:rPr>
           <w:rFonts w:asciiTheme="minorHAnsi" w:hAnsiTheme="minorHAnsi" w:cstheme="minorHAnsi"/>
         </w:rPr>
+        <w:lastRenderedPageBreak/>
         <w:t>Postman Request and Response Validation</w:t>
       </w:r>
     </w:p>
@@ -3527,8 +3517,8 @@
       <w:r>
         <w:rPr>
           <w:rFonts w:asciiTheme="minorHAnsi" w:hAnsiTheme="minorHAnsi" w:cstheme="minorHAnsi"/>
-        </w:rPr>
-        <w:lastRenderedPageBreak/>
+          <w:noProof/>
+        </w:rPr>
         <w:drawing>
           <wp:inline distT="0" distB="0" distL="0" distR="0" wp14:anchorId="629F805A" wp14:editId="2EAF8397">
             <wp:extent cx="5731510" cy="2279015"/>
@@ -3613,6 +3603,7 @@
       <w:r>
         <w:rPr>
           <w:rFonts w:asciiTheme="minorHAnsi" w:hAnsiTheme="minorHAnsi" w:cstheme="minorHAnsi"/>
+          <w:noProof/>
         </w:rPr>
         <w:drawing>
           <wp:inline distT="0" distB="0" distL="0" distR="0" wp14:anchorId="5DDA2E07" wp14:editId="140EE812">
@@ -3715,6 +3706,7 @@
       <w:r>
         <w:rPr>
           <w:rFonts w:asciiTheme="minorHAnsi" w:hAnsiTheme="minorHAnsi" w:cstheme="minorHAnsi"/>
+          <w:noProof/>
         </w:rPr>
         <w:lastRenderedPageBreak/>
         <w:drawing>
@@ -3766,6 +3758,7 @@
       <w:r>
         <w:rPr>
           <w:rFonts w:asciiTheme="minorHAnsi" w:hAnsiTheme="minorHAnsi" w:cstheme="minorHAnsi"/>
+          <w:noProof/>
         </w:rPr>
         <w:drawing>
           <wp:anchor distT="0" distB="0" distL="114300" distR="114300" simplePos="0" relativeHeight="251662848" behindDoc="1" locked="0" layoutInCell="1" allowOverlap="1" wp14:anchorId="5681E707" wp14:editId="295123D9">
@@ -3905,6 +3898,7 @@
           <w:rFonts w:asciiTheme="minorHAnsi" w:hAnsiTheme="minorHAnsi" w:cstheme="minorHAnsi"/>
           <w:b/>
           <w:bCs/>
+          <w:noProof/>
         </w:rPr>
         <w:lastRenderedPageBreak/>
         <w:drawing>
@@ -3995,6 +3989,7 @@
           <w:rFonts w:asciiTheme="minorHAnsi" w:hAnsiTheme="minorHAnsi" w:cstheme="minorHAnsi"/>
           <w:b/>
           <w:bCs/>
+          <w:noProof/>
         </w:rPr>
         <w:drawing>
           <wp:inline distT="0" distB="0" distL="0" distR="0" wp14:anchorId="252367A2" wp14:editId="5A4B87CB">
@@ -4108,6 +4103,7 @@
           <w:rFonts w:asciiTheme="minorHAnsi" w:hAnsiTheme="minorHAnsi" w:cstheme="minorHAnsi"/>
           <w:b/>
           <w:bCs/>
+          <w:noProof/>
         </w:rPr>
         <w:lastRenderedPageBreak/>
         <w:drawing>
@@ -4197,13 +4193,6 @@
           <w:bCs/>
         </w:rPr>
         <w:tab/>
-      </w:r>
-      <w:r>
-        <w:rPr>
-          <w:rFonts w:asciiTheme="minorHAnsi" w:hAnsiTheme="minorHAnsi" w:cstheme="minorHAnsi"/>
-          <w:b/>
-          <w:bCs/>
-        </w:rPr>
         <w:t xml:space="preserve">Fig. No. </w:t>
       </w:r>
       <w:r>
@@ -4238,6 +4227,7 @@
           <w:rFonts w:asciiTheme="minorHAnsi" w:hAnsiTheme="minorHAnsi" w:cstheme="minorHAnsi"/>
           <w:b/>
           <w:bCs/>
+          <w:noProof/>
         </w:rPr>
         <w:drawing>
           <wp:inline distT="0" distB="0" distL="0" distR="0" wp14:anchorId="186D323F" wp14:editId="512BBD67">
@@ -4327,6 +4317,7 @@
           <w:rFonts w:asciiTheme="minorHAnsi" w:hAnsiTheme="minorHAnsi" w:cstheme="minorHAnsi"/>
           <w:b/>
           <w:bCs/>
+          <w:noProof/>
         </w:rPr>
         <w:lastRenderedPageBreak/>
         <w:drawing>
@@ -4417,6 +4408,7 @@
           <w:rFonts w:asciiTheme="minorHAnsi" w:hAnsiTheme="minorHAnsi" w:cstheme="minorHAnsi"/>
           <w:b/>
           <w:bCs/>
+          <w:noProof/>
         </w:rPr>
         <w:drawing>
           <wp:inline distT="0" distB="0" distL="0" distR="0" wp14:anchorId="1F560BEF" wp14:editId="4122675F">
@@ -4506,6 +4498,7 @@
           <w:rFonts w:asciiTheme="minorHAnsi" w:hAnsiTheme="minorHAnsi" w:cstheme="minorHAnsi"/>
           <w:b/>
           <w:bCs/>
+          <w:noProof/>
         </w:rPr>
         <w:lastRenderedPageBreak/>
         <w:drawing>
@@ -4611,6 +4604,7 @@
           <w:rFonts w:asciiTheme="minorHAnsi" w:hAnsiTheme="minorHAnsi" w:cstheme="minorHAnsi"/>
           <w:b/>
           <w:bCs/>
+          <w:noProof/>
         </w:rPr>
         <w:drawing>
           <wp:inline distT="0" distB="0" distL="0" distR="0" wp14:anchorId="73E4BFEB" wp14:editId="550CEEF2">
@@ -4684,6 +4678,7 @@
           <w:rFonts w:asciiTheme="minorHAnsi" w:hAnsiTheme="minorHAnsi" w:cstheme="minorHAnsi"/>
           <w:b/>
           <w:bCs/>
+          <w:noProof/>
         </w:rPr>
         <w:lastRenderedPageBreak/>
         <w:drawing>
@@ -5241,6 +5236,7 @@
   <w:style w:type="character" w:default="1" w:styleId="DefaultParagraphFont">
     <w:name w:val="Default Paragraph Font"/>
     <w:uiPriority w:val="1"/>
+    <w:semiHidden/>
     <w:unhideWhenUsed/>
   </w:style>
   <w:style w:type="table" w:default="1" w:styleId="TableNormal">

</xml_diff>